<commit_message>
feat(rrl, tech bg): add new article by Chen Et. Al
</commit_message>
<xml_diff>
--- a/chapters/03-technical-background/draft.docx
+++ b/chapters/03-technical-background/draft.docx
@@ -2,7 +2,7 @@
 <file path=word/document.xml><?xml version="1.0" encoding="utf-8"?>
 <w:document xmlns:w="http://schemas.openxmlformats.org/wordprocessingml/2006/main" xmlns:m="http://schemas.openxmlformats.org/officeDocument/2006/math" xmlns:r="http://schemas.openxmlformats.org/officeDocument/2006/relationships" xmlns:o="urn:schemas-microsoft-com:office:office" xmlns:v="urn:schemas-microsoft-com:vml" xmlns:w10="urn:schemas-microsoft-com:office:word" xmlns:a="http://schemas.openxmlformats.org/drawingml/2006/main" xmlns:pic="http://schemas.openxmlformats.org/drawingml/2006/picture" xmlns:wp="http://schemas.openxmlformats.org/drawingml/2006/wordprocessingDrawing">
   <w:body>
-    <w:bookmarkStart w:id="46" w:name="chapter-3-technical-background"/>
+    <w:bookmarkStart w:id="47" w:name="chapter-3-technical-background"/>
     <w:p>
       <w:pPr>
         <w:pStyle w:val="Heading1"/>
@@ -3726,7 +3726,7 @@
     </w:p>
     <w:bookmarkEnd w:id="29"/>
     <w:bookmarkEnd w:id="30"/>
-    <w:bookmarkStart w:id="41" w:name="existing-technologies-frameworks"/>
+    <w:bookmarkStart w:id="42" w:name="existing-technologies-frameworks"/>
     <w:p>
       <w:pPr>
         <w:pStyle w:val="Heading2"/>
@@ -3772,7 +3772,7 @@
         <w:t xml:space="preserve"> </w:t>
       </w:r>
       <w:r>
-        <w:t xml:space="preserve">stack (a library, a backbone architecture, and a frozen encoder) and a</w:t>
+        <w:t xml:space="preserve">stack (a library, a backbone architecture, a frozen encoder, and a parameter-efficient adaptation method) and a</w:t>
       </w:r>
       <w:r>
         <w:t xml:space="preserve"> </w:t>
@@ -4433,13 +4433,559 @@
       </w:r>
     </w:p>
     <w:bookmarkEnd w:id="35"/>
-    <w:bookmarkStart w:id="39" w:name="structural-similarity-metrics"/>
+    <w:bookmarkStart w:id="36" w:name="parameter-efficient-fine-tuning"/>
     <w:p>
       <w:pPr>
         <w:pStyle w:val="Heading3"/>
       </w:pPr>
       <w:r>
-        <w:t xml:space="preserve">3.4.3 Structural-Similarity Metrics</w:t>
+        <w:t xml:space="preserve">3.4.3 Parameter-Efficient Fine-Tuning</w:t>
+      </w:r>
+    </w:p>
+    <w:p>
+      <w:pPr>
+        <w:pStyle w:val="FirstParagraph"/>
+      </w:pPr>
+      <w:r>
+        <w:t xml:space="preserve">A frozen encoder trades adaptation for economy: its weights never move, so it cannot specialize to type. Full fine-tuning restores that specialization but at prohibitive cost, updating all of the backbone’s parameters (87.2 million for a ViT-B/14) and storing a full copy per task.</w:t>
+      </w:r>
+      <w:r>
+        <w:t xml:space="preserve"> </w:t>
+      </w:r>
+      <w:r>
+        <w:rPr>
+          <w:b/>
+          <w:bCs/>
+        </w:rPr>
+        <w:t xml:space="preserve">Parameter-efficient fine-tuning (PEFT)</w:t>
+      </w:r>
+      <w:r>
+        <w:t xml:space="preserve"> </w:t>
+      </w:r>
+      <w:r>
+        <w:t xml:space="preserve">is the middle path, adapting a large pre-trained model to a new task by training only a small set of new parameters while the original weights stay frozen. The dominant PEFT method is</w:t>
+      </w:r>
+      <w:r>
+        <w:t xml:space="preserve"> </w:t>
+      </w:r>
+      <w:r>
+        <w:rPr>
+          <w:b/>
+          <w:bCs/>
+        </w:rPr>
+        <w:t xml:space="preserve">Low-Rank Adaptation (LoRA)</w:t>
+      </w:r>
+      <w:r>
+        <w:t xml:space="preserve">, which rests on the observation that the</w:t>
+      </w:r>
+      <w:r>
+        <w:t xml:space="preserve"> </w:t>
+      </w:r>
+      <w:r>
+        <w:rPr>
+          <w:i/>
+          <w:iCs/>
+        </w:rPr>
+        <w:t xml:space="preserve">update</w:t>
+      </w:r>
+      <w:r>
+        <w:t xml:space="preserve"> </w:t>
+      </w:r>
+      <w:r>
+        <w:t xml:space="preserve">a model needs for a new task has low intrinsic rank. Rather than learn a full weight-update matrix</w:t>
+      </w:r>
+      <w:r>
+        <w:t xml:space="preserve"> </w:t>
+      </w:r>
+      <m:oMath>
+        <m:r>
+          <m:rPr>
+            <m:sty m:val="p"/>
+          </m:rPr>
+          <m:t>Δ</m:t>
+        </m:r>
+        <m:r>
+          <m:t>W</m:t>
+        </m:r>
+      </m:oMath>
+      <w:r>
+        <w:t xml:space="preserve"> </w:t>
+      </w:r>
+      <w:r>
+        <w:t xml:space="preserve">for a layer, LoRA factors it into two thin matrices:</w:t>
+      </w:r>
+    </w:p>
+    <w:p>
+      <w:pPr>
+        <w:pStyle w:val="BodyText"/>
+      </w:pPr>
+      <m:oMathPara>
+        <m:oMathParaPr>
+          <m:jc m:val="center"/>
+        </m:oMathParaPr>
+        <m:oMath>
+          <m:sSup>
+            <m:e>
+              <m:r>
+                <m:t>W</m:t>
+              </m:r>
+            </m:e>
+            <m:sup>
+              <m:r>
+                <m:rPr>
+                  <m:sty m:val="p"/>
+                </m:rPr>
+                <m:t>′</m:t>
+              </m:r>
+            </m:sup>
+          </m:sSup>
+          <m:r>
+            <m:rPr>
+              <m:sty m:val="p"/>
+            </m:rPr>
+            <m:t>=</m:t>
+          </m:r>
+          <m:sSub>
+            <m:e>
+              <m:r>
+                <m:t>W</m:t>
+              </m:r>
+            </m:e>
+            <m:sub>
+              <m:r>
+                <m:t>0</m:t>
+              </m:r>
+            </m:sub>
+          </m:sSub>
+          <m:r>
+            <m:rPr>
+              <m:sty m:val="p"/>
+            </m:rPr>
+            <m:t>+</m:t>
+          </m:r>
+          <m:r>
+            <m:rPr>
+              <m:sty m:val="p"/>
+            </m:rPr>
+            <m:t>Δ</m:t>
+          </m:r>
+          <m:r>
+            <m:t>W</m:t>
+          </m:r>
+          <m:r>
+            <m:rPr>
+              <m:sty m:val="p"/>
+            </m:rPr>
+            <m:t>=</m:t>
+          </m:r>
+          <m:sSub>
+            <m:e>
+              <m:r>
+                <m:t>W</m:t>
+              </m:r>
+            </m:e>
+            <m:sub>
+              <m:r>
+                <m:t>0</m:t>
+              </m:r>
+            </m:sub>
+          </m:sSub>
+          <m:r>
+            <m:rPr>
+              <m:sty m:val="p"/>
+            </m:rPr>
+            <m:t>+</m:t>
+          </m:r>
+          <m:f>
+            <m:fPr>
+              <m:type m:val="bar"/>
+            </m:fPr>
+            <m:num>
+              <m:r>
+                <m:t>α</m:t>
+              </m:r>
+            </m:num>
+            <m:den>
+              <m:r>
+                <m:t>r</m:t>
+              </m:r>
+            </m:den>
+          </m:f>
+          <m:r>
+            <m:t> </m:t>
+          </m:r>
+          <m:r>
+            <m:t>B</m:t>
+          </m:r>
+          <m:r>
+            <m:t>A</m:t>
+          </m:r>
+          <m:r>
+            <m:rPr>
+              <m:sty m:val="p"/>
+            </m:rPr>
+            <m:t>,</m:t>
+          </m:r>
+        </m:oMath>
+      </m:oMathPara>
+    </w:p>
+    <w:p>
+      <w:pPr>
+        <w:pStyle w:val="FirstParagraph"/>
+      </w:pPr>
+      <w:r>
+        <w:t xml:space="preserve">where</w:t>
+      </w:r>
+      <w:r>
+        <w:t xml:space="preserve"> </w:t>
+      </w:r>
+      <m:oMath>
+        <m:sSub>
+          <m:e>
+            <m:r>
+              <m:t>W</m:t>
+            </m:r>
+          </m:e>
+          <m:sub>
+            <m:r>
+              <m:t>0</m:t>
+            </m:r>
+          </m:sub>
+        </m:sSub>
+      </m:oMath>
+      <w:r>
+        <w:t xml:space="preserve"> </w:t>
+      </w:r>
+      <w:r>
+        <w:t xml:space="preserve">is the frozen pre-trained weight matrix,</w:t>
+      </w:r>
+      <w:r>
+        <w:t xml:space="preserve"> </w:t>
+      </w:r>
+      <m:oMath>
+        <m:r>
+          <m:t>A</m:t>
+        </m:r>
+      </m:oMath>
+      <w:r>
+        <w:t xml:space="preserve"> </w:t>
+      </w:r>
+      <w:r>
+        <w:t xml:space="preserve">and</w:t>
+      </w:r>
+      <w:r>
+        <w:t xml:space="preserve"> </w:t>
+      </w:r>
+      <m:oMath>
+        <m:r>
+          <m:t>B</m:t>
+        </m:r>
+      </m:oMath>
+      <w:r>
+        <w:t xml:space="preserve"> </w:t>
+      </w:r>
+      <w:r>
+        <w:t xml:space="preserve">are the trainable low-rank factors (with</w:t>
+      </w:r>
+      <w:r>
+        <w:t xml:space="preserve"> </w:t>
+      </w:r>
+      <m:oMath>
+        <m:r>
+          <m:t>A</m:t>
+        </m:r>
+        <m:r>
+          <m:rPr>
+            <m:sty m:val="p"/>
+          </m:rPr>
+          <m:t>∈</m:t>
+        </m:r>
+        <m:sSup>
+          <m:e>
+            <m:r>
+              <m:rPr>
+                <m:scr m:val="double-struck"/>
+                <m:sty m:val="p"/>
+              </m:rPr>
+              <m:t>R</m:t>
+            </m:r>
+          </m:e>
+          <m:sup>
+            <m:r>
+              <m:t>r</m:t>
+            </m:r>
+            <m:r>
+              <m:rPr>
+                <m:sty m:val="p"/>
+              </m:rPr>
+              <m:t>×</m:t>
+            </m:r>
+            <m:r>
+              <m:t>k</m:t>
+            </m:r>
+          </m:sup>
+        </m:sSup>
+      </m:oMath>
+      <w:r>
+        <w:t xml:space="preserve">,</w:t>
+      </w:r>
+      <w:r>
+        <w:t xml:space="preserve"> </w:t>
+      </w:r>
+      <m:oMath>
+        <m:r>
+          <m:t>B</m:t>
+        </m:r>
+        <m:r>
+          <m:rPr>
+            <m:sty m:val="p"/>
+          </m:rPr>
+          <m:t>∈</m:t>
+        </m:r>
+        <m:sSup>
+          <m:e>
+            <m:r>
+              <m:rPr>
+                <m:scr m:val="double-struck"/>
+                <m:sty m:val="p"/>
+              </m:rPr>
+              <m:t>R</m:t>
+            </m:r>
+          </m:e>
+          <m:sup>
+            <m:r>
+              <m:t>d</m:t>
+            </m:r>
+            <m:r>
+              <m:rPr>
+                <m:sty m:val="p"/>
+              </m:rPr>
+              <m:t>×</m:t>
+            </m:r>
+            <m:r>
+              <m:t>r</m:t>
+            </m:r>
+          </m:sup>
+        </m:sSup>
+      </m:oMath>
+      <w:r>
+        <w:t xml:space="preserve">),</w:t>
+      </w:r>
+      <w:r>
+        <w:t xml:space="preserve"> </w:t>
+      </w:r>
+      <m:oMath>
+        <m:r>
+          <m:t>r</m:t>
+        </m:r>
+      </m:oMath>
+      <w:r>
+        <w:t xml:space="preserve"> </w:t>
+      </w:r>
+      <w:r>
+        <w:t xml:space="preserve">is the</w:t>
+      </w:r>
+      <w:r>
+        <w:t xml:space="preserve"> </w:t>
+      </w:r>
+      <w:r>
+        <w:rPr>
+          <w:b/>
+          <w:bCs/>
+        </w:rPr>
+        <w:t xml:space="preserve">rank</w:t>
+      </w:r>
+      <w:r>
+        <w:t xml:space="preserve"> </w:t>
+      </w:r>
+      <w:r>
+        <w:t xml:space="preserve">(a small integer, e.g. </w:t>
+      </w:r>
+      <m:oMath>
+        <m:r>
+          <m:t>r</m:t>
+        </m:r>
+        <m:r>
+          <m:rPr>
+            <m:sty m:val="p"/>
+          </m:rPr>
+          <m:t>=</m:t>
+        </m:r>
+        <m:r>
+          <m:t>8</m:t>
+        </m:r>
+      </m:oMath>
+      <w:r>
+        <w:t xml:space="preserve">, that bounds how much the update can express), and</w:t>
+      </w:r>
+      <w:r>
+        <w:t xml:space="preserve"> </w:t>
+      </w:r>
+      <m:oMath>
+        <m:r>
+          <m:t>α</m:t>
+        </m:r>
+      </m:oMath>
+      <w:r>
+        <w:t xml:space="preserve"> </w:t>
+      </w:r>
+      <w:r>
+        <w:t xml:space="preserve">is a</w:t>
+      </w:r>
+      <w:r>
+        <w:t xml:space="preserve"> </w:t>
+      </w:r>
+      <w:r>
+        <w:rPr>
+          <w:b/>
+          <w:bCs/>
+        </w:rPr>
+        <w:t xml:space="preserve">scaling factor</w:t>
+      </w:r>
+      <w:r>
+        <w:t xml:space="preserve"> </w:t>
+      </w:r>
+      <w:r>
+        <w:t xml:space="preserve">that controls the update’s magnitude. Because</w:t>
+      </w:r>
+      <w:r>
+        <w:t xml:space="preserve"> </w:t>
+      </w:r>
+      <m:oMath>
+        <m:r>
+          <m:t>r</m:t>
+        </m:r>
+      </m:oMath>
+      <w:r>
+        <w:t xml:space="preserve"> </w:t>
+      </w:r>
+      <w:r>
+        <w:t xml:space="preserve">is far smaller than the layer’s dimensions, the product</w:t>
+      </w:r>
+      <w:r>
+        <w:t xml:space="preserve"> </w:t>
+      </w:r>
+      <m:oMath>
+        <m:r>
+          <m:t>B</m:t>
+        </m:r>
+        <m:r>
+          <m:t>A</m:t>
+        </m:r>
+      </m:oMath>
+      <w:r>
+        <w:t xml:space="preserve"> </w:t>
+      </w:r>
+      <w:r>
+        <w:t xml:space="preserve">reconstructs a full-size update from a tiny number of parameters. Chen et al. (2026) adapt a frozen DINOv2 ViT-B/14 to font classification this way with</w:t>
+      </w:r>
+      <w:r>
+        <w:t xml:space="preserve"> </w:t>
+      </w:r>
+      <m:oMath>
+        <m:r>
+          <m:t>r</m:t>
+        </m:r>
+        <m:r>
+          <m:rPr>
+            <m:sty m:val="p"/>
+          </m:rPr>
+          <m:t>=</m:t>
+        </m:r>
+        <m:r>
+          <m:t>8</m:t>
+        </m:r>
+      </m:oMath>
+      <w:r>
+        <w:t xml:space="preserve"> </w:t>
+      </w:r>
+      <w:r>
+        <w:t xml:space="preserve">and</w:t>
+      </w:r>
+      <w:r>
+        <w:t xml:space="preserve"> </w:t>
+      </w:r>
+      <m:oMath>
+        <m:r>
+          <m:t>α</m:t>
+        </m:r>
+        <m:r>
+          <m:rPr>
+            <m:sty m:val="p"/>
+          </m:rPr>
+          <m:t>=</m:t>
+        </m:r>
+        <m:r>
+          <m:t>16</m:t>
+        </m:r>
+      </m:oMath>
+      <w:r>
+        <w:t xml:space="preserve">, training roughly 150,000 parameters — about 0.2% of the backbone — and reach approximately 86% Top-1 accuracy across 394 Google Font variants, with the trained factors mergeable back into</w:t>
+      </w:r>
+      <w:r>
+        <w:t xml:space="preserve"> </w:t>
+      </w:r>
+      <m:oMath>
+        <m:sSub>
+          <m:e>
+            <m:r>
+              <m:t>W</m:t>
+            </m:r>
+          </m:e>
+          <m:sub>
+            <m:r>
+              <m:t>0</m:t>
+            </m:r>
+          </m:sub>
+        </m:sSub>
+      </m:oMath>
+      <w:r>
+        <w:t xml:space="preserve"> </w:t>
+      </w:r>
+      <w:r>
+        <w:t xml:space="preserve">so inference incurs no added cost. The strength is decisive economy: the frozen backbone preserves its general visual knowledge while a negligible adapter specializes it, avoiding both the compute of full fine-tuning and the label-free ceiling of a purely frozen encoder. The limitations are equally direct and shape this thesis’s design. LoRA adaptation is</w:t>
+      </w:r>
+      <w:r>
+        <w:t xml:space="preserve"> </w:t>
+      </w:r>
+      <w:r>
+        <w:rPr>
+          <w:b/>
+          <w:bCs/>
+        </w:rPr>
+        <w:t xml:space="preserve">supervised and closed-set</w:t>
+      </w:r>
+      <w:r>
+        <w:t xml:space="preserve"> </w:t>
+      </w:r>
+      <w:r>
+        <w:t xml:space="preserve">— Chen et al. train on labeled synthetic renders over a fixed 394-class catalogue — and their model, trained exclusively on pristine synthetic type, is self-reported to fail on photographs and heavily styled graphics; its residual errors concentrate between near-identical weight variants of the same family (family-level accuracy falls to 40.2%), which the authors attribute to detail lost at the 224×224 input resolution. PEFT thus offers a cheap route to a</w:t>
+      </w:r>
+      <w:r>
+        <w:t xml:space="preserve"> </w:t>
+      </w:r>
+      <w:r>
+        <w:rPr>
+          <w:i/>
+          <w:iCs/>
+        </w:rPr>
+        <w:t xml:space="preserve">specialized</w:t>
+      </w:r>
+      <w:r>
+        <w:t xml:space="preserve"> </w:t>
+      </w:r>
+      <w:r>
+        <w:t xml:space="preserve">typographic encoder, but one whose closed-set, clean-glyph training is the very regime this thesis’s open-set, deformation-robust framing is built to move beyond.</w:t>
+      </w:r>
+    </w:p>
+    <w:bookmarkEnd w:id="36"/>
+    <w:bookmarkStart w:id="40" w:name="structural-similarity-metrics"/>
+    <w:p>
+      <w:pPr>
+        <w:pStyle w:val="Heading3"/>
+      </w:pPr>
+      <w:r>
+        <w:t xml:space="preserve">3.4.4 Structural-Similarity Metrics</w:t>
       </w:r>
     </w:p>
     <w:p>
@@ -5029,18 +5575,18 @@
           <wp:inline>
             <wp:extent cx="5334000" cy="1947111"/>
             <wp:effectExtent b="0" l="0" r="0" t="0"/>
-            <wp:docPr descr="Pipeline rendering a predicted font to a clean glyph, then scoring its structural similarity against the deformed input crop" title="" id="37" name="Picture"/>
+            <wp:docPr descr="Pipeline rendering a predicted font to a clean glyph, then scoring its structural similarity against the deformed input crop" title="" id="38" name="Picture"/>
             <a:graphic>
               <a:graphicData uri="http://schemas.openxmlformats.org/drawingml/2006/picture">
                 <pic:pic>
                   <pic:nvPicPr>
-                    <pic:cNvPr descr="../../assets/figures/ssim_pipeline.png" id="38" name="Picture"/>
+                    <pic:cNvPr descr="../../assets/figures/ssim_pipeline.png" id="39" name="Picture"/>
                     <pic:cNvPicPr>
                       <a:picLocks noChangeArrowheads="1" noChangeAspect="1"/>
                     </pic:cNvPicPr>
                   </pic:nvPicPr>
                   <pic:blipFill>
-                    <a:blip r:embed="rId36"/>
+                    <a:blip r:embed="rId37"/>
                     <a:stretch>
                       <a:fillRect/>
                     </a:stretch>
@@ -5128,14 +5674,14 @@
         <w:t xml:space="preserve">. Both are deformation-robust in principle, but both were validated on natural-image translation tasks, never on re-rendered glyphs. That untested transfer is what this thesis must confront.</w:t>
       </w:r>
     </w:p>
-    <w:bookmarkEnd w:id="39"/>
-    <w:bookmarkStart w:id="40" w:name="Xb2ba548ddb24054d07ef266eb2aef5761a7f5c0"/>
+    <w:bookmarkEnd w:id="40"/>
+    <w:bookmarkStart w:id="41" w:name="Xb2ba548ddb24054d07ef266eb2aef5761a7f5c0"/>
     <w:p>
       <w:pPr>
         <w:pStyle w:val="Heading3"/>
       </w:pPr>
       <w:r>
-        <w:t xml:space="preserve">3.4.4 Latent Diffusion as the Generative Source</w:t>
+        <w:t xml:space="preserve">3.4.5 Latent Diffusion as the Generative Source</w:t>
       </w:r>
     </w:p>
     <w:p>
@@ -5159,9 +5705,9 @@
         <w:t xml:space="preserve">, the class of generative models that synthesize images by iteratively denoising a compressed latent representation. Kondo et al. (2024) show that interpolating in this latent space natively emits novel, unclassified glyph geometries with fluid visual traits, which is peer-reviewed evidence that typographic deformation is intrinsic to the model class. Its strength as a generator is its weakness for this thesis: the process is uncontrolled with respect to font identity and produces glyphs that belong to no catalogued typeface. Diffusion is therefore the source of the problem this framework must handle, not a solution to it. That is why the thesis treats its deformed output as the input distribution, which the following chapter’s pipeline is built to handle.</w:t>
       </w:r>
     </w:p>
-    <w:bookmarkEnd w:id="40"/>
     <w:bookmarkEnd w:id="41"/>
-    <w:bookmarkStart w:id="45" w:name="problem-context"/>
+    <w:bookmarkEnd w:id="42"/>
+    <w:bookmarkStart w:id="46" w:name="problem-context"/>
     <w:p>
       <w:pPr>
         <w:pStyle w:val="Heading2"/>
@@ -5361,18 +5907,18 @@
           <wp:inline>
             <wp:extent cx="5334000" cy="6733568"/>
             <wp:effectExtent b="0" l="0" r="0" t="0"/>
-            <wp:docPr descr="Flowchart of the proposed pipeline: a GenAI image feeds attention-based crop isolation, then a frozen Vision Transformer encoder, then a metric-embedding head, then open-set ranking with a calibrated Top-K shortlist over the localized Google-Fonts palette" title="" id="43" name="Picture"/>
+            <wp:docPr descr="Flowchart of the proposed pipeline: a GenAI image feeds attention-based crop isolation, then a frozen Vision Transformer encoder, then a metric-embedding head, then open-set ranking with a calibrated Top-K shortlist over the localized Google-Fonts palette" title="" id="44" name="Picture"/>
             <a:graphic>
               <a:graphicData uri="http://schemas.openxmlformats.org/drawingml/2006/picture">
                 <pic:pic>
                   <pic:nvPicPr>
-                    <pic:cNvPr descr="../../assets/figures/system_pipeline.png" id="44" name="Picture"/>
+                    <pic:cNvPr descr="../../assets/figures/system_pipeline.png" id="45" name="Picture"/>
                     <pic:cNvPicPr>
                       <a:picLocks noChangeArrowheads="1" noChangeAspect="1"/>
                     </pic:cNvPicPr>
                   </pic:nvPicPr>
                   <pic:blipFill>
-                    <a:blip r:embed="rId42"/>
+                    <a:blip r:embed="rId43"/>
                     <a:stretch>
                       <a:fillRect/>
                     </a:stretch>
@@ -5423,8 +5969,8 @@
         <w:t xml:space="preserve">Having established the typographic, deep-learning, metric-learning, and open-set foundations, along with the specific technical gap they leave open, the next chapter details the synthetic-degradation pipeline that manufactures deformed training data, the model architecture that embeds and ranks each crop, and the evaluation protocol that measures the framework against a human-proxy baseline.</w:t>
       </w:r>
     </w:p>
-    <w:bookmarkEnd w:id="45"/>
     <w:bookmarkEnd w:id="46"/>
+    <w:bookmarkEnd w:id="47"/>
     <w:sectPr>
       <w:footnotePr>
         <w:numRestart w:val="eachSect"/>

</xml_diff>